<commit_message>
supp info and new synechococcus papers
</commit_message>
<xml_diff>
--- a/doc/blog posts/1 why omics and llms - 100326.docx
+++ b/doc/blog posts/1 why omics and llms - 100326.docx
@@ -59,102 +59,65 @@
         </w:rPr>
         <w:t xml:space="preserve">Omics is the ability to sequence living cells, which opens up a world of questions: What's </w:t>
       </w:r>
-      <w:ins w:id="0" w:author="דניאל שר" w:date="2026-02-24T22:40:00Z" w16du:dateUtc="2026-02-24T20:40:00Z">
-        <w:r>
-          <w:rPr>
-            <w:rFonts w:ascii="Courier New" w:hAnsi="Courier New" w:cs="Courier New"/>
-            <w:lang w:val="en-US"/>
-          </w:rPr>
-          <w:t>uniqu</w:t>
-        </w:r>
-      </w:ins>
-      <w:ins w:id="1" w:author="דניאל שר" w:date="2026-02-24T22:41:00Z" w16du:dateUtc="2026-02-24T20:41:00Z">
-        <w:r>
-          <w:rPr>
-            <w:rFonts w:ascii="Courier New" w:hAnsi="Courier New" w:cs="Courier New"/>
-            <w:lang w:val="en-US"/>
-          </w:rPr>
-          <w:t xml:space="preserve">e about </w:t>
-        </w:r>
-      </w:ins>
+      <w:r>
+        <w:rPr>
+          <w:rFonts w:ascii="Courier New" w:hAnsi="Courier New" w:cs="Courier New"/>
+          <w:lang w:val="en-US"/>
+        </w:rPr>
+        <w:t xml:space="preserve">unique about </w:t>
+      </w:r>
       <w:r>
         <w:rPr>
           <w:rFonts w:ascii="Courier New" w:hAnsi="Courier New" w:cs="Courier New"/>
         </w:rPr>
         <w:t>someone's DNA</w:t>
       </w:r>
-      <w:ins w:id="2" w:author="דניאל שר" w:date="2026-02-24T22:41:00Z" w16du:dateUtc="2026-02-24T20:41:00Z">
-        <w:r>
-          <w:rPr>
-            <w:rFonts w:ascii="Courier New" w:hAnsi="Courier New" w:cs="Courier New"/>
-            <w:lang w:val="en-US"/>
-          </w:rPr>
-          <w:t xml:space="preserve"> compared to </w:t>
-        </w:r>
-        <w:r>
-          <w:rPr>
-            <w:rFonts w:ascii="Courier New" w:hAnsi="Courier New" w:cs="Courier New"/>
-            <w:lang w:val="en-US"/>
-          </w:rPr>
-          <w:t xml:space="preserve">that of </w:t>
-        </w:r>
-        <w:r>
-          <w:rPr>
-            <w:rFonts w:ascii="Courier New" w:hAnsi="Courier New" w:cs="Courier New"/>
-            <w:lang w:val="en-US"/>
-          </w:rPr>
-          <w:t>other people</w:t>
-        </w:r>
-      </w:ins>
-      <w:r>
-        <w:rPr>
-          <w:rFonts w:ascii="Courier New" w:hAnsi="Courier New" w:cs="Courier New"/>
-        </w:rPr>
-        <w:t xml:space="preserve">? </w:t>
-      </w:r>
-      <w:del w:id="3" w:author="דניאל שר" w:date="2026-02-24T22:41:00Z" w16du:dateUtc="2026-02-24T20:41:00Z">
-        <w:r>
-          <w:rPr>
-            <w:rFonts w:ascii="Courier New" w:hAnsi="Courier New" w:cs="Courier New"/>
-          </w:rPr>
-          <w:delText xml:space="preserve">How does it differ from others? </w:delText>
-        </w:r>
-      </w:del>
-      <w:r>
-        <w:rPr>
-          <w:rFonts w:ascii="Courier New" w:hAnsi="Courier New" w:cs="Courier New"/>
-        </w:rPr>
-        <w:t xml:space="preserve">What mutations do they carry? </w:t>
-      </w:r>
-      <w:del w:id="4" w:author="דניאל שר" w:date="2026-02-24T22:40:00Z" w16du:dateUtc="2026-02-24T20:40:00Z">
-        <w:r>
-          <w:rPr>
-            <w:rFonts w:ascii="Courier New" w:hAnsi="Courier New" w:cs="Courier New"/>
-          </w:rPr>
-          <w:delText xml:space="preserve">What </w:delText>
-        </w:r>
-      </w:del>
-      <w:ins w:id="5" w:author="דניאל שר" w:date="2026-02-24T22:40:00Z" w16du:dateUtc="2026-02-24T20:40:00Z">
-        <w:r>
-          <w:rPr>
-            <w:rFonts w:ascii="Courier New" w:hAnsi="Courier New" w:cs="Courier New"/>
-          </w:rPr>
-          <w:t>Wh</w:t>
-        </w:r>
-        <w:r>
-          <w:rPr>
-            <w:rFonts w:ascii="Courier New" w:hAnsi="Courier New" w:cs="Courier New"/>
-            <w:lang w:val="en-US"/>
-          </w:rPr>
-          <w:t>ich</w:t>
-        </w:r>
-        <w:r>
-          <w:rPr>
-            <w:rFonts w:ascii="Courier New" w:hAnsi="Courier New" w:cs="Courier New"/>
-          </w:rPr>
-          <w:t xml:space="preserve"> </w:t>
-        </w:r>
-      </w:ins>
+      <w:r>
+        <w:rPr>
+          <w:rFonts w:ascii="Courier New" w:hAnsi="Courier New" w:cs="Courier New"/>
+          <w:lang w:val="en-US"/>
+        </w:rPr>
+        <w:t xml:space="preserve"> compared to </w:t>
+      </w:r>
+      <w:r>
+        <w:rPr>
+          <w:rFonts w:ascii="Courier New" w:hAnsi="Courier New" w:cs="Courier New"/>
+          <w:lang w:val="en-US"/>
+        </w:rPr>
+        <w:t xml:space="preserve">that of </w:t>
+      </w:r>
+      <w:r>
+        <w:rPr>
+          <w:rFonts w:ascii="Courier New" w:hAnsi="Courier New" w:cs="Courier New"/>
+          <w:lang w:val="en-US"/>
+        </w:rPr>
+        <w:t>other people</w:t>
+      </w:r>
+      <w:r>
+        <w:rPr>
+          <w:rFonts w:ascii="Courier New" w:hAnsi="Courier New" w:cs="Courier New"/>
+        </w:rPr>
+        <w:t xml:space="preserve">? What mutations do they carry? </w:t>
+      </w:r>
+      <w:r>
+        <w:rPr>
+          <w:rFonts w:ascii="Courier New" w:hAnsi="Courier New" w:cs="Courier New"/>
+        </w:rPr>
+        <w:t>Wh</w:t>
+      </w:r>
+      <w:r>
+        <w:rPr>
+          <w:rFonts w:ascii="Courier New" w:hAnsi="Courier New" w:cs="Courier New"/>
+          <w:lang w:val="en-US"/>
+        </w:rPr>
+        <w:t>ich</w:t>
+      </w:r>
+      <w:r>
+        <w:rPr>
+          <w:rFonts w:ascii="Courier New" w:hAnsi="Courier New" w:cs="Courier New"/>
+        </w:rPr>
+        <w:t xml:space="preserve"> </w:t>
+      </w:r>
       <w:r>
         <w:rPr>
           <w:rFonts w:ascii="Courier New" w:hAnsi="Courier New" w:cs="Courier New"/>
@@ -226,11 +189,6 @@
         <w:rPr>
           <w:rFonts w:ascii="Courier New" w:hAnsi="Courier New" w:cs="Courier New"/>
           <w:lang w:val="en-US"/>
-          <w:rPrChange w:id="6" w:author="דניאל שר" w:date="2026-02-24T22:42:00Z" w16du:dateUtc="2026-02-24T20:42:00Z">
-            <w:rPr>
-              <w:rFonts w:ascii="Courier New" w:hAnsi="Courier New" w:cs="Courier New"/>
-            </w:rPr>
-          </w:rPrChange>
         </w:rPr>
       </w:pPr>
       <w:r>
@@ -239,15 +197,13 @@
         </w:rPr>
         <w:t>- Investigate how bacteria in your gut interact. Do they help each other or compete?</w:t>
       </w:r>
-      <w:ins w:id="7" w:author="דניאל שר" w:date="2026-02-24T22:42:00Z" w16du:dateUtc="2026-02-24T20:42:00Z">
-        <w:r>
-          <w:rPr>
-            <w:rFonts w:ascii="Courier New" w:hAnsi="Courier New" w:cs="Courier New"/>
-            <w:lang w:val="en-US"/>
-          </w:rPr>
-          <w:t xml:space="preserve"> How do they interact with us, their hosts?</w:t>
-        </w:r>
-      </w:ins>
+      <w:r>
+        <w:rPr>
+          <w:rFonts w:ascii="Courier New" w:hAnsi="Courier New" w:cs="Courier New"/>
+          <w:lang w:val="en-US"/>
+        </w:rPr>
+        <w:t xml:space="preserve"> How do they interact with us, their hosts?</w:t>
+      </w:r>
     </w:p>
     <w:p>
       <w:pPr>
@@ -460,78 +416,40 @@
         </w:rPr>
         <w:t xml:space="preserve">People have thought about this before, and they came up with clever solutions. One approach: group genes into pathways. So you might say, "Fifty of those 3,000 upregulated genes are involved in amino acid synthesis. Maybe the cell is working on that right now." That works, but it's limited. </w:t>
       </w:r>
-      <w:ins w:id="8" w:author="דניאל שר" w:date="2026-02-24T22:44:00Z" w16du:dateUtc="2026-02-24T20:44:00Z">
-        <w:r>
-          <w:rPr>
-            <w:rFonts w:ascii="Courier New" w:hAnsi="Courier New" w:cs="Courier New"/>
-            <w:lang w:val="en-US"/>
-          </w:rPr>
-          <w:t xml:space="preserve">There are still often dozens of </w:t>
-        </w:r>
-      </w:ins>
-      <w:ins w:id="9" w:author="דניאל שר" w:date="2026-02-24T22:45:00Z" w16du:dateUtc="2026-02-24T20:45:00Z">
-        <w:r>
-          <w:rPr>
-            <w:rFonts w:ascii="Courier New" w:hAnsi="Courier New" w:cs="Courier New"/>
-            <w:lang w:val="en-US"/>
-          </w:rPr>
-          <w:t xml:space="preserve">pathways being turned on and off (or, more likely, </w:t>
-        </w:r>
-        <w:r>
-          <w:rPr>
-            <w:rFonts w:ascii="Courier New" w:hAnsi="Courier New" w:cs="Courier New"/>
-            <w:lang w:val="en-US"/>
-          </w:rPr>
-          <w:t xml:space="preserve">tuned to be expressed more or less). </w:t>
-        </w:r>
-      </w:ins>
+      <w:r>
+        <w:rPr>
+          <w:rFonts w:ascii="Courier New" w:hAnsi="Courier New" w:cs="Courier New"/>
+          <w:lang w:val="en-US"/>
+        </w:rPr>
+        <w:t xml:space="preserve">There are still often dozens of pathways being turned on and off (or, more likely, </w:t>
+      </w:r>
+      <w:r>
+        <w:rPr>
+          <w:rFonts w:ascii="Courier New" w:hAnsi="Courier New" w:cs="Courier New"/>
+          <w:lang w:val="en-US"/>
+        </w:rPr>
+        <w:t xml:space="preserve">tuned to be expressed more or less). </w:t>
+      </w:r>
       <w:r>
         <w:rPr>
           <w:rFonts w:ascii="Courier New" w:hAnsi="Courier New" w:cs="Courier New"/>
         </w:rPr>
         <w:t xml:space="preserve">Many genes play roles in multiple pathways, </w:t>
       </w:r>
-      <w:del w:id="10" w:author="דניאל שר" w:date="2026-02-24T22:45:00Z" w16du:dateUtc="2026-02-24T20:45:00Z">
-        <w:r>
-          <w:rPr>
-            <w:rFonts w:ascii="Courier New" w:hAnsi="Courier New" w:cs="Courier New"/>
-          </w:rPr>
-          <w:delText>including energy metabolism</w:delText>
-        </w:r>
-      </w:del>
-      <w:ins w:id="11" w:author="דניאל שר" w:date="2026-02-24T22:45:00Z" w16du:dateUtc="2026-02-24T20:45:00Z">
-        <w:r>
-          <w:rPr>
-            <w:rFonts w:ascii="Courier New" w:hAnsi="Courier New" w:cs="Courier New"/>
-            <w:lang w:val="en-US"/>
-          </w:rPr>
-          <w:t>so which on</w:t>
-        </w:r>
-      </w:ins>
-      <w:ins w:id="12" w:author="דניאל שר" w:date="2026-02-24T22:46:00Z" w16du:dateUtc="2026-02-24T20:46:00Z">
-        <w:r>
-          <w:rPr>
-            <w:rFonts w:ascii="Courier New" w:hAnsi="Courier New" w:cs="Courier New"/>
-            <w:lang w:val="en-US"/>
-          </w:rPr>
-          <w:t>e of the</w:t>
-        </w:r>
-        <w:r>
-          <w:rPr>
-            <w:rFonts w:ascii="Courier New" w:hAnsi="Courier New" w:cs="Courier New"/>
-            <w:lang w:val="en-US"/>
-          </w:rPr>
-          <w:t>m is actually regulated?</w:t>
-        </w:r>
-      </w:ins>
-      <w:del w:id="13" w:author="דניאל שר" w:date="2026-02-24T22:46:00Z" w16du:dateUtc="2026-02-24T20:46:00Z">
-        <w:r>
-          <w:rPr>
-            <w:rFonts w:ascii="Courier New" w:hAnsi="Courier New" w:cs="Courier New"/>
-          </w:rPr>
-          <w:delText>.</w:delText>
-        </w:r>
-      </w:del>
+      <w:r>
+        <w:rPr>
+          <w:rFonts w:ascii="Courier New" w:hAnsi="Courier New" w:cs="Courier New"/>
+          <w:lang w:val="en-US"/>
+        </w:rPr>
+        <w:t>so which one of the</w:t>
+      </w:r>
+      <w:r>
+        <w:rPr>
+          <w:rFonts w:ascii="Courier New" w:hAnsi="Courier New" w:cs="Courier New"/>
+          <w:lang w:val="en-US"/>
+        </w:rPr>
+        <w:t>m is actually regulated?</w:t>
+      </w:r>
       <w:r>
         <w:rPr>
           <w:rFonts w:ascii="Courier New" w:hAnsi="Courier New" w:cs="Courier New"/>
@@ -558,6 +476,7 @@
         <w:rPr>
           <w:rFonts w:ascii="Courier New" w:hAnsi="Courier New" w:cs="Courier New"/>
         </w:rPr>
+        <w:lastRenderedPageBreak/>
         <w:t>Another approach: take all the genes with known chemical reactions, plug them into a massive metabolic model with cascading reactions, and see what molecules the cell is actually producing. This kind of metabolic modeling is gaining momentum.</w:t>
       </w:r>
     </w:p>
@@ -582,107 +501,66 @@
         </w:rPr>
         <w:t xml:space="preserve">But </w:t>
       </w:r>
-      <w:del w:id="14" w:author="דניאל שר" w:date="2026-02-24T22:46:00Z" w16du:dateUtc="2026-02-24T20:46:00Z">
-        <w:r>
-          <w:rPr>
-            <w:rFonts w:ascii="Courier New" w:hAnsi="Courier New" w:cs="Courier New"/>
-          </w:rPr>
-          <w:delText>here's where it gets interesting</w:delText>
-        </w:r>
-      </w:del>
-      <w:ins w:id="15" w:author="דניאל שר" w:date="2026-02-24T22:46:00Z" w16du:dateUtc="2026-02-24T20:46:00Z">
-        <w:r>
-          <w:rPr>
-            <w:rFonts w:ascii="Courier New" w:hAnsi="Courier New" w:cs="Courier New"/>
-            <w:lang w:val="en-US"/>
-          </w:rPr>
-          <w:t>we’re still not there</w:t>
-        </w:r>
-      </w:ins>
+      <w:r>
+        <w:rPr>
+          <w:rFonts w:ascii="Courier New" w:hAnsi="Courier New" w:cs="Courier New"/>
+          <w:lang w:val="en-US"/>
+        </w:rPr>
+        <w:t>we’re still not there</w:t>
+      </w:r>
       <w:r>
         <w:rPr>
           <w:rFonts w:ascii="Courier New" w:hAnsi="Courier New" w:cs="Courier New"/>
         </w:rPr>
         <w:t xml:space="preserve">. </w:t>
       </w:r>
-      <w:ins w:id="16" w:author="דניאל שר" w:date="2026-02-24T22:46:00Z" w16du:dateUtc="2026-02-24T20:46:00Z">
-        <w:r>
-          <w:rPr>
-            <w:rFonts w:ascii="Courier New" w:hAnsi="Courier New" w:cs="Courier New"/>
-            <w:lang w:val="en-US"/>
-          </w:rPr>
-          <w:t xml:space="preserve">These analyses are </w:t>
-        </w:r>
-        <w:r>
-          <w:rPr>
-            <w:rFonts w:ascii="Courier New" w:hAnsi="Courier New" w:cs="Courier New"/>
-            <w:lang w:val="en-US"/>
-          </w:rPr>
-          <w:t xml:space="preserve">powerful but still a bit </w:t>
-        </w:r>
-      </w:ins>
-      <w:del w:id="17" w:author="דניאל שר" w:date="2026-02-24T22:46:00Z" w16du:dateUtc="2026-02-24T20:46:00Z">
-        <w:r>
-          <w:rPr>
-            <w:rFonts w:ascii="Courier New" w:hAnsi="Courier New" w:cs="Courier New"/>
-          </w:rPr>
-          <w:delText>All of this is still somewhat s</w:delText>
-        </w:r>
-      </w:del>
-      <w:ins w:id="18" w:author="דניאל שר" w:date="2026-02-24T22:47:00Z" w16du:dateUtc="2026-02-24T20:47:00Z">
-        <w:r>
-          <w:rPr>
-            <w:rFonts w:ascii="Courier New" w:hAnsi="Courier New" w:cs="Courier New"/>
-            <w:lang w:val="en-US"/>
-          </w:rPr>
-          <w:t>s</w:t>
-        </w:r>
-      </w:ins>
+      <w:r>
+        <w:rPr>
+          <w:rFonts w:ascii="Courier New" w:hAnsi="Courier New" w:cs="Courier New"/>
+          <w:lang w:val="en-US"/>
+        </w:rPr>
+        <w:t xml:space="preserve">These analyses are </w:t>
+      </w:r>
+      <w:r>
+        <w:rPr>
+          <w:rFonts w:ascii="Courier New" w:hAnsi="Courier New" w:cs="Courier New"/>
+          <w:lang w:val="en-US"/>
+        </w:rPr>
+        <w:t>powerful but still a bit s</w:t>
+      </w:r>
       <w:r>
         <w:rPr>
           <w:rFonts w:ascii="Courier New" w:hAnsi="Courier New" w:cs="Courier New"/>
         </w:rPr>
         <w:t>implistic</w:t>
       </w:r>
-      <w:ins w:id="19" w:author="דניאל שר" w:date="2026-02-24T22:47:00Z" w16du:dateUtc="2026-02-24T20:47:00Z">
-        <w:r>
-          <w:rPr>
-            <w:rFonts w:ascii="Courier New" w:hAnsi="Courier New" w:cs="Courier New"/>
-            <w:lang w:val="en-US"/>
-          </w:rPr>
-          <w:t>, and interpreting these data takes a lot of expert knowledge</w:t>
-        </w:r>
-      </w:ins>
+      <w:r>
+        <w:rPr>
+          <w:rFonts w:ascii="Courier New" w:hAnsi="Courier New" w:cs="Courier New"/>
+          <w:lang w:val="en-US"/>
+        </w:rPr>
+        <w:t>, and interpreting these data takes a lot of expert knowledge</w:t>
+      </w:r>
       <w:r>
         <w:rPr>
           <w:rFonts w:ascii="Courier New" w:hAnsi="Courier New" w:cs="Courier New"/>
         </w:rPr>
         <w:t xml:space="preserve">. </w:t>
       </w:r>
-      <w:ins w:id="20" w:author="דניאל שר" w:date="2026-02-24T22:47:00Z" w16du:dateUtc="2026-02-24T20:47:00Z">
-        <w:r>
-          <w:rPr>
-            <w:rFonts w:ascii="Courier New" w:hAnsi="Courier New" w:cs="Courier New"/>
-            <w:lang w:val="en-US"/>
-          </w:rPr>
-          <w:t xml:space="preserve">Also, we often analyze the data from a single experiment alone, with limited integration </w:t>
-        </w:r>
-        <w:r>
-          <w:rPr>
-            <w:rFonts w:ascii="Courier New" w:hAnsi="Courier New" w:cs="Courier New"/>
-            <w:lang w:val="en-US"/>
-          </w:rPr>
-          <w:t xml:space="preserve">with the </w:t>
-        </w:r>
-      </w:ins>
-      <w:del w:id="21" w:author="דניאל שר" w:date="2026-02-24T22:47:00Z" w16du:dateUtc="2026-02-24T20:47:00Z">
-        <w:r>
-          <w:rPr>
-            <w:rFonts w:ascii="Courier New" w:hAnsi="Courier New" w:cs="Courier New"/>
-          </w:rPr>
-          <w:delText xml:space="preserve">We're not really leveraging the </w:delText>
-        </w:r>
-      </w:del>
+      <w:r>
+        <w:rPr>
+          <w:rFonts w:ascii="Courier New" w:hAnsi="Courier New" w:cs="Courier New"/>
+          <w:lang w:val="en-US"/>
+        </w:rPr>
+        <w:t xml:space="preserve">Also, we often analyze the data from a single experiment alone, with limited integration </w:t>
+      </w:r>
+      <w:r>
+        <w:rPr>
+          <w:rFonts w:ascii="Courier New" w:hAnsi="Courier New" w:cs="Courier New"/>
+          <w:lang w:val="en-US"/>
+        </w:rPr>
+        <w:t xml:space="preserve">with the </w:t>
+      </w:r>
       <w:r>
         <w:rPr>
           <w:rFonts w:ascii="Courier New" w:hAnsi="Courier New" w:cs="Courier New"/>
@@ -711,15 +589,13 @@
         </w:rPr>
         <w:t xml:space="preserve">In the next post, I'll talk about </w:t>
       </w:r>
-      <w:ins w:id="22" w:author="דניאל שר" w:date="2026-02-24T22:44:00Z" w16du:dateUtc="2026-02-24T20:44:00Z">
-        <w:r>
-          <w:rPr>
-            <w:rFonts w:ascii="Courier New" w:hAnsi="Courier New" w:cs="Courier New"/>
-            <w:lang w:val="en-US"/>
-          </w:rPr>
-          <w:t xml:space="preserve">some ideas on </w:t>
-        </w:r>
-      </w:ins>
+      <w:r>
+        <w:rPr>
+          <w:rFonts w:ascii="Courier New" w:hAnsi="Courier New" w:cs="Courier New"/>
+          <w:lang w:val="en-US"/>
+        </w:rPr>
+        <w:t xml:space="preserve">some ideas on </w:t>
+      </w:r>
       <w:r>
         <w:rPr>
           <w:rFonts w:ascii="Courier New" w:hAnsi="Courier New" w:cs="Courier New"/>
@@ -743,14 +619,6 @@
     </w:sectPr>
   </w:body>
 </w:document>
-</file>
-
-<file path=word/people.xml><?xml version="1.0" encoding="utf-8"?>
-<w15:people xmlns:wpc="http://schemas.microsoft.com/office/word/2010/wordprocessingCanvas" xmlns:cx="http://schemas.microsoft.com/office/drawing/2014/chartex" xmlns:cx1="http://schemas.microsoft.com/office/drawing/2015/9/8/chartex" xmlns:cx2="http://schemas.microsoft.com/office/drawing/2015/10/21/chartex" xmlns:cx3="http://schemas.microsoft.com/office/drawing/2016/5/9/chartex" xmlns:cx4="http://schemas.microsoft.com/office/drawing/2016/5/10/chartex" xmlns:cx5="http://schemas.microsoft.com/office/drawing/2016/5/11/chartex" xmlns:cx6="http://schemas.microsoft.com/office/drawing/2016/5/12/chartex" xmlns:cx7="http://schemas.microsoft.com/office/drawing/2016/5/13/chartex" xmlns:cx8="http://schemas.microsoft.com/office/drawing/2016/5/14/chartex" xmlns:mc="http://schemas.openxmlformats.org/markup-compatibility/2006" xmlns:aink="http://schemas.microsoft.com/office/drawing/2016/ink" xmlns:am3d="http://schemas.microsoft.com/office/drawing/2017/model3d" xmlns:o="urn:schemas-microsoft-com:office:office" xmlns:oel="http://schemas.microsoft.com/office/2019/extlst" xmlns:r="http://schemas.openxmlformats.org/officeDocument/2006/relationships" xmlns:m="http://schemas.openxmlformats.org/officeDocument/2006/math" xmlns:v="urn:schemas-microsoft-com:vml" xmlns:wp14="http://schemas.microsoft.com/office/word/2010/wordprocessingDrawing" xmlns:wp="http://schemas.openxmlformats.org/drawingml/2006/wordprocessingDrawing" xmlns:w10="urn:schemas-microsoft-com:office:word" xmlns:w="http://schemas.openxmlformats.org/wordprocessingml/2006/main" xmlns:w14="http://schemas.microsoft.com/office/word/2010/wordml" xmlns:w15="http://schemas.microsoft.com/office/word/2012/wordml" xmlns:w16cex="http://schemas.microsoft.com/office/word/2018/wordml/cex" xmlns:w16cid="http://schemas.microsoft.com/office/word/2016/wordml/cid" xmlns:w16="http://schemas.microsoft.com/office/word/2018/wordml" xmlns:w16du="http://schemas.microsoft.com/office/word/2023/wordml/word16du" xmlns:w16sdtdh="http://schemas.microsoft.com/office/word/2020/wordml/sdtdatahash" xmlns:w16sdtfl="http://schemas.microsoft.com/office/word/2024/wordml/sdtformatlock" xmlns:w16se="http://schemas.microsoft.com/office/word/2015/wordml/symex" xmlns:wpg="http://schemas.microsoft.com/office/word/2010/wordprocessingGroup" xmlns:wpi="http://schemas.microsoft.com/office/word/2010/wordprocessingInk" xmlns:wne="http://schemas.microsoft.com/office/word/2006/wordml" xmlns:wps="http://schemas.microsoft.com/office/word/2010/wordprocessingShape" mc:Ignorable="w14 w15 w16se w16cid w16 w16cex w16sdtdh w16sdtfl w16du wp14">
-  <w15:person w15:author="דניאל שר">
-    <w15:presenceInfo w15:providerId="AD" w15:userId="S::dsher@univ.haifa.ac.il::76184611-3f43-4117-baca-bc673ff4fd6b"/>
-  </w15:person>
-</w15:people>
 </file>
 
 <file path=word/styles.xml><?xml version="1.0" encoding="utf-8"?>

</xml_diff>